<commit_message>
change cover page of portfolio
</commit_message>
<xml_diff>
--- a/MECH191_metallurgy/semesterActivity/MECH191_Modules_ImageBased.docx
+++ b/MECH191_metallurgy/semesterActivity/MECH191_Modules_ImageBased.docx
@@ -25,7 +25,11 @@
         <w:pStyle w:val="Normal"/>
         <w:spacing w:before="0" w:after="260"/>
         <w:jc w:val="center"/>
-        <w:rPr/>
+        <w:rPr>
+          <w:color w:val="555555"/>
+          <w:sz w:val="22"/>
+          <w:szCs w:val="22"/>
+        </w:rPr>
       </w:pPr>
       <w:r>
         <w:rPr>
@@ -35,23 +39,7 @@
           <w:sz w:val="30"/>
           <w:szCs w:val="30"/>
         </w:rPr>
-        <w:t>Semester Metallography Portfolio — Reference-Repository Edition</w:t>
-      </w:r>
-    </w:p>
-    <w:p>
-      <w:pPr>
-        <w:pStyle w:val="Normal"/>
-        <w:spacing w:before="0" w:after="80"/>
-        <w:jc w:val="center"/>
-        <w:rPr/>
-      </w:pPr>
-      <w:r>
-        <w:rPr>
-          <w:color w:val="555555"/>
-          <w:sz w:val="22"/>
-          <w:szCs w:val="22"/>
-        </w:rPr>
-        <w:t>Image-Based Alternate Version — uses published reference micrographs in place of live microscopy</w:t>
+        <w:t>Semester Metallography Portfolio</w:t>
       </w:r>
     </w:p>
     <w:p>
@@ -191,7 +179,7 @@
         <w:pBdr>
           <w:bottom w:val="single" w:sz="8" w:space="4" w:color="1F4E79"/>
         </w:pBdr>
-        <w:spacing w:before="280" w:after="140"/>
+        <w:spacing w:before="0" w:after="140"/>
         <w:rPr>
           <w:b/>
           <w:bCs/>
@@ -1625,8 +1613,8 @@
       </w:tblPr>
       <w:tblGrid>
         <w:gridCol w:w="2268"/>
-        <w:gridCol w:w="1441"/>
-        <w:gridCol w:w="5645"/>
+        <w:gridCol w:w="1440"/>
+        <w:gridCol w:w="5646"/>
       </w:tblGrid>
       <w:tr>
         <w:trPr>
@@ -1664,7 +1652,7 @@
         </w:tc>
         <w:tc>
           <w:tcPr>
-            <w:tcW w:w="1441" w:type="dxa"/>
+            <w:tcW w:w="1440" w:type="dxa"/>
             <w:tcBorders>
               <w:top w:val="single" w:sz="4" w:space="0" w:color="000000"/>
               <w:start w:val="single" w:sz="4" w:space="0" w:color="000000"/>
@@ -1694,7 +1682,7 @@
         </w:tc>
         <w:tc>
           <w:tcPr>
-            <w:tcW w:w="5645" w:type="dxa"/>
+            <w:tcW w:w="5646" w:type="dxa"/>
             <w:tcBorders>
               <w:top w:val="single" w:sz="4" w:space="0" w:color="000000"/>
               <w:start w:val="single" w:sz="4" w:space="0" w:color="000000"/>
@@ -1755,7 +1743,7 @@
         </w:tc>
         <w:tc>
           <w:tcPr>
-            <w:tcW w:w="1441" w:type="dxa"/>
+            <w:tcW w:w="1440" w:type="dxa"/>
             <w:tcBorders>
               <w:top w:val="single" w:sz="4" w:space="0" w:color="000000"/>
               <w:start w:val="single" w:sz="4" w:space="0" w:color="000000"/>
@@ -1788,7 +1776,7 @@
         </w:tc>
         <w:tc>
           <w:tcPr>
-            <w:tcW w:w="5645" w:type="dxa"/>
+            <w:tcW w:w="5646" w:type="dxa"/>
             <w:vMerge w:val="restart"/>
             <w:tcBorders>
               <w:top w:val="single" w:sz="4" w:space="0" w:color="000000"/>
@@ -1964,7 +1952,7 @@
         </w:tc>
         <w:tc>
           <w:tcPr>
-            <w:tcW w:w="1441" w:type="dxa"/>
+            <w:tcW w:w="1440" w:type="dxa"/>
             <w:tcBorders>
               <w:top w:val="single" w:sz="4" w:space="0" w:color="000000"/>
               <w:start w:val="single" w:sz="4" w:space="0" w:color="000000"/>
@@ -1997,7 +1985,7 @@
         </w:tc>
         <w:tc>
           <w:tcPr>
-            <w:tcW w:w="5645" w:type="dxa"/>
+            <w:tcW w:w="5646" w:type="dxa"/>
             <w:vMerge w:val="continue"/>
             <w:tcBorders>
               <w:top w:val="single" w:sz="4" w:space="0" w:color="000000"/>
@@ -2050,7 +2038,7 @@
         </w:tc>
         <w:tc>
           <w:tcPr>
-            <w:tcW w:w="1441" w:type="dxa"/>
+            <w:tcW w:w="1440" w:type="dxa"/>
             <w:tcBorders>
               <w:top w:val="single" w:sz="4" w:space="0" w:color="000000"/>
               <w:start w:val="single" w:sz="4" w:space="0" w:color="000000"/>
@@ -2083,7 +2071,7 @@
         </w:tc>
         <w:tc>
           <w:tcPr>
-            <w:tcW w:w="5645" w:type="dxa"/>
+            <w:tcW w:w="5646" w:type="dxa"/>
             <w:vMerge w:val="continue"/>
             <w:tcBorders>
               <w:top w:val="single" w:sz="4" w:space="0" w:color="000000"/>
@@ -2136,7 +2124,7 @@
         </w:tc>
         <w:tc>
           <w:tcPr>
-            <w:tcW w:w="1441" w:type="dxa"/>
+            <w:tcW w:w="1440" w:type="dxa"/>
             <w:tcBorders>
               <w:top w:val="single" w:sz="4" w:space="0" w:color="000000"/>
               <w:start w:val="single" w:sz="4" w:space="0" w:color="000000"/>
@@ -2169,7 +2157,7 @@
         </w:tc>
         <w:tc>
           <w:tcPr>
-            <w:tcW w:w="5645" w:type="dxa"/>
+            <w:tcW w:w="5646" w:type="dxa"/>
             <w:vMerge w:val="continue"/>
             <w:tcBorders>
               <w:top w:val="single" w:sz="4" w:space="0" w:color="000000"/>
@@ -2222,7 +2210,7 @@
         </w:tc>
         <w:tc>
           <w:tcPr>
-            <w:tcW w:w="1441" w:type="dxa"/>
+            <w:tcW w:w="1440" w:type="dxa"/>
             <w:tcBorders>
               <w:top w:val="single" w:sz="4" w:space="0" w:color="000000"/>
               <w:start w:val="single" w:sz="4" w:space="0" w:color="000000"/>
@@ -2255,7 +2243,7 @@
         </w:tc>
         <w:tc>
           <w:tcPr>
-            <w:tcW w:w="5645" w:type="dxa"/>
+            <w:tcW w:w="5646" w:type="dxa"/>
             <w:vMerge w:val="continue"/>
             <w:tcBorders>
               <w:top w:val="single" w:sz="4" w:space="0" w:color="000000"/>
@@ -2308,7 +2296,7 @@
         </w:tc>
         <w:tc>
           <w:tcPr>
-            <w:tcW w:w="1441" w:type="dxa"/>
+            <w:tcW w:w="1440" w:type="dxa"/>
             <w:tcBorders>
               <w:top w:val="single" w:sz="4" w:space="0" w:color="000000"/>
               <w:start w:val="single" w:sz="4" w:space="0" w:color="000000"/>
@@ -2341,7 +2329,7 @@
         </w:tc>
         <w:tc>
           <w:tcPr>
-            <w:tcW w:w="5645" w:type="dxa"/>
+            <w:tcW w:w="5646" w:type="dxa"/>
             <w:vMerge w:val="continue"/>
             <w:tcBorders>
               <w:top w:val="single" w:sz="4" w:space="0" w:color="000000"/>
@@ -19279,7 +19267,7 @@
     <w:p>
       <w:pPr>
         <w:pStyle w:val="Heading3"/>
-        <w:spacing w:before="220" w:after="90"/>
+        <w:spacing w:before="0" w:after="90"/>
         <w:rPr>
           <w:b/>
           <w:bCs/>
@@ -19897,7 +19885,7 @@
         <w:pBdr>
           <w:bottom w:val="single" w:sz="8" w:space="4" w:color="1F4E79"/>
         </w:pBdr>
-        <w:spacing w:before="280" w:after="140"/>
+        <w:spacing w:before="0" w:after="140"/>
         <w:rPr>
           <w:b/>
           <w:bCs/>
@@ -21254,8 +21242,8 @@
       <w:u w:val="single"/>
     </w:rPr>
   </w:style>
-  <w:style w:type="character" w:styleId="FootnoteCharactersuser">
-    <w:name w:val="Footnote Characters (user)"/>
+  <w:style w:type="character" w:styleId="FootnoteCharacters">
+    <w:name w:val="Footnote Characters"/>
     <w:uiPriority w:val="99"/>
     <w:semiHidden/>
     <w:unhideWhenUsed/>
@@ -21264,8 +21252,8 @@
       <w:vertAlign w:val="superscript"/>
     </w:rPr>
   </w:style>
-  <w:style w:type="character" w:styleId="FootnoteCharacters">
-    <w:name w:val="Footnote Characters"/>
+  <w:style w:type="character" w:styleId="FootnoteCharactersuser">
+    <w:name w:val="Footnote Characters (user)"/>
     <w:qFormat/>
     <w:rPr>
       <w:vertAlign w:val="superscript"/>
@@ -21289,8 +21277,8 @@
       <w:szCs w:val="20"/>
     </w:rPr>
   </w:style>
-  <w:style w:type="character" w:styleId="EndnoteCharactersuser">
-    <w:name w:val="Endnote Characters (user)"/>
+  <w:style w:type="character" w:styleId="EndnoteCharacters">
+    <w:name w:val="Endnote Characters"/>
     <w:uiPriority w:val="99"/>
     <w:semiHidden/>
     <w:unhideWhenUsed/>
@@ -21299,8 +21287,8 @@
       <w:vertAlign w:val="superscript"/>
     </w:rPr>
   </w:style>
-  <w:style w:type="character" w:styleId="EndnoteCharacters">
-    <w:name w:val="Endnote Characters"/>
+  <w:style w:type="character" w:styleId="EndnoteCharactersuser">
+    <w:name w:val="Endnote Characters (user)"/>
     <w:qFormat/>
     <w:rPr>
       <w:vertAlign w:val="superscript"/>

</xml_diff>